<commit_message>
English literature reviews 19-23 (with English figures) and a citation fix in review 9
Co-Authored-By: Claude Opus 5.5 <noreply@anthropic.com>
Claude-Session: https://claude.ai/code/session_016Cdcj2FTAQGBVsJUyYJR2M
</commit_message>
<xml_diff>
--- a/docs/literature/Literature_review_Causal_Modelling_Stochastic_Deterministic_Complex_Systems_2020-2026.docx
+++ b/docs/literature/Literature_review_Causal_Modelling_Stochastic_Deterministic_Complex_Systems_2020-2026.docx
@@ -4249,7 +4249,7 @@
         <w:jc w:val="both"/>
       </w:pPr>
       <w:r>
-        <w:t xml:space="preserve">For chaotic and deterministic systems: causality that changes from one region of the attractor to another in turbulence and in the Walker circulation [C1], chaotic internal variability as a limit of statistical attribution [H1], and the deterministic nonlinear dynamics of an epidemic as a cause competing with climate [P4].</w:t>
+        <w:t xml:space="preserve">For chaotic and deterministic systems: causality that changes from one region of the attractor to another in turbulence and in the Walker circulation [C1], chaotic internal variability as a limitation of statistical attribution [H1], and the deterministic nonlinear dynamics of an epidemic as a cause competing with climate [P4].</w:t>
       </w:r>
     </w:p>
     <w:p>
@@ -4668,7 +4668,7 @@
         <w:jc w:val="both"/>
       </w:pPr>
       <w:r>
-        <w:t xml:space="preserve">Causal discovery has received a strong negative result, equivalence classes are exponentially large when there are cycles or hidden causes [C2], and two answers: reconstruction of the regulatory network of a differential equation with guarantees [BK3] and random interventions as instruments at whole-brain scale [P1]; the effects of interventions in epidemics are estimated with semi-mechanistic models [O2].</w:t>
+        <w:t xml:space="preserve">Causal discovery has received a strong negative result—equivalence classes are exponentially large when there are cycles or hidden causes [C2]—and two answers: reconstruction of the regulatory network of a differential equation with guarantees [BK3] and random interventions as instruments at whole-brain scale [P1]; the effects of interventions in epidemics are estimated with semi-mechanistic models [O2].</w:t>
       </w:r>
     </w:p>
     <w:p>
@@ -8042,7 +8042,7 @@
             <w:vAlign w:val="top"/>
           </w:tcPr>
           <w:p>
-            <w:hyperlink w:history="1" r:id="rId8i0qtfysninyjleahcjq2">
+            <w:hyperlink w:history="1" r:id="rIdizvecrstqhfl_afolgrud">
               <w:r>
                 <w:rPr>
                   <w:color w:val="1D4ED8"/>
@@ -9022,7 +9022,7 @@
             <w:vAlign w:val="top"/>
           </w:tcPr>
           <w:p>
-            <w:hyperlink w:history="1" r:id="rIdzclzphowsyxd47n03_lbt">
+            <w:hyperlink w:history="1" r:id="rIdhqnvygrm9g60ngvgzefsn">
               <w:r>
                 <w:rPr>
                   <w:color w:val="1D4ED8"/>
@@ -9717,7 +9717,7 @@
           <w:sz w:val="19"/>
           <w:szCs w:val="19"/>
         </w:rPr>
-        <w:t xml:space="preserve"> the basic number of the country, </w:t>
+        <w:t xml:space="preserve"> the basic reproduction number of the country, </w:t>
       </w:r>
       <m:oMath>
         <m:sSub>
@@ -10207,7 +10207,7 @@
             <w:vAlign w:val="top"/>
           </w:tcPr>
           <w:p>
-            <w:hyperlink w:history="1" r:id="rIdgod7ayhwvofeuwfutcsjn">
+            <w:hyperlink w:history="1" r:id="rIdyi2e_xvm6mawrnndspero">
               <w:r>
                 <w:rPr>
                   <w:color w:val="1D4ED8"/>
@@ -11400,7 +11400,7 @@
             <w:vAlign w:val="top"/>
           </w:tcPr>
           <w:p>
-            <w:hyperlink w:history="1" r:id="rIdh6kyzz5uniemk4_48yleh">
+            <w:hyperlink w:history="1" r:id="rId-oz0os_g6ad0plgfjhrwq">
               <w:r>
                 <w:rPr>
                   <w:color w:val="1D4ED8"/>
@@ -12549,7 +12549,7 @@
             <w:vAlign w:val="top"/>
           </w:tcPr>
           <w:p>
-            <w:hyperlink w:history="1" r:id="rIdasv-kgcjupmitpmyw2zwf">
+            <w:hyperlink w:history="1" r:id="rIdnayxtq9tg_1cemtbqx5mt">
               <w:r>
                 <w:rPr>
                   <w:color w:val="1D4ED8"/>
@@ -13793,7 +13793,7 @@
             <w:vAlign w:val="top"/>
           </w:tcPr>
           <w:p>
-            <w:hyperlink w:history="1" r:id="rIdbm3gft5nafwugulyeheiq">
+            <w:hyperlink w:history="1" r:id="rIdnfw333g5mxl46tp6jezlw">
               <w:r>
                 <w:rPr>
                   <w:color w:val="1D4ED8"/>
@@ -15034,7 +15034,7 @@
             <w:vAlign w:val="top"/>
           </w:tcPr>
           <w:p>
-            <w:hyperlink w:history="1" r:id="rIdzlr8mxwzewvozi4bdppf5">
+            <w:hyperlink w:history="1" r:id="rIdawvpfgkhjndocdde8ciam">
               <w:r>
                 <w:rPr>
                   <w:color w:val="1D4ED8"/>
@@ -16437,7 +16437,7 @@
             <w:vAlign w:val="top"/>
           </w:tcPr>
           <w:p>
-            <w:hyperlink w:history="1" r:id="rIdwoknd6vqttiqsw6iaxzcw">
+            <w:hyperlink w:history="1" r:id="rIddtjriddhr3f_ywjldx1zy">
               <w:r>
                 <w:rPr>
                   <w:color w:val="1D4ED8"/>
@@ -17704,7 +17704,7 @@
             <w:vAlign w:val="top"/>
           </w:tcPr>
           <w:p>
-            <w:hyperlink w:history="1" r:id="rIdyk9noklbr4psgbfz6n01q">
+            <w:hyperlink w:history="1" r:id="rId9a7ifehm3sxf1flpcg2bu">
               <w:r>
                 <w:rPr>
                   <w:color w:val="1D4ED8"/>
@@ -19116,7 +19116,7 @@
             <w:vAlign w:val="top"/>
           </w:tcPr>
           <w:p>
-            <w:hyperlink w:history="1" r:id="rIdcmdx79n_pryjqds8sv_vw">
+            <w:hyperlink w:history="1" r:id="rId-cyewgiw0okp-mzb3ucrm">
               <w:r>
                 <w:rPr>
                   <w:color w:val="1D4ED8"/>
@@ -20468,7 +20468,7 @@
             <w:vAlign w:val="top"/>
           </w:tcPr>
           <w:p>
-            <w:hyperlink w:history="1" r:id="rIdcwu5xjvqclapjnalelijf">
+            <w:hyperlink w:history="1" r:id="rIdru3dxqxn9psmolusdlme8">
               <w:r>
                 <w:rPr>
                   <w:color w:val="1D4ED8"/>
@@ -21707,7 +21707,7 @@
         <w:t xml:space="preserve">INNOVATION  </w:t>
       </w:r>
       <w:r>
-        <w:t xml:space="preserve">The first uniform post-selection inference on individual regulatory functions in a nonparametric differential equation, that is, statements with stated confidence about the causal structure of a deterministic dynamical system.</w:t>
+        <w:t xml:space="preserve">The first uniform post-selection inference on individual regulatory functions in a nonparametric differential equation, that is, confidence statements about the causal structure of a deterministic dynamical system.</w:t>
       </w:r>
     </w:p>
     <w:p>
@@ -21888,7 +21888,7 @@
             <w:vAlign w:val="top"/>
           </w:tcPr>
           <w:p>
-            <w:hyperlink w:history="1" r:id="rIdlvsyhogvnvi47tbxtwhjt">
+            <w:hyperlink w:history="1" r:id="rId9nb4wyr_baxjygqwvidrr">
               <w:r>
                 <w:rPr>
                   <w:color w:val="1D4ED8"/>
@@ -23314,7 +23314,7 @@
             <w:vAlign w:val="top"/>
           </w:tcPr>
           <w:p>
-            <w:hyperlink w:history="1" r:id="rIdnxeoznt1aharrhy5-dhop">
+            <w:hyperlink w:history="1" r:id="rId9trxj_vozyz0wwulqsehl">
               <w:r>
                 <w:rPr>
                   <w:color w:val="1D4ED8"/>
@@ -24539,7 +24539,7 @@
             <w:vAlign w:val="top"/>
           </w:tcPr>
           <w:p>
-            <w:hyperlink w:history="1" r:id="rIdm7-ciadlhina8pyy3uoig">
+            <w:hyperlink w:history="1" r:id="rIdgstek8ffmz1ghu3ymgsag">
               <w:r>
                 <w:rPr>
                   <w:color w:val="1D4ED8"/>
@@ -25825,7 +25825,7 @@
             <w:vAlign w:val="top"/>
           </w:tcPr>
           <w:p>
-            <w:hyperlink w:history="1" r:id="rIdgrl_sb3s-2xafmtwj3sx4">
+            <w:hyperlink w:history="1" r:id="rIdx6zpzvvknopeyayzs3gty">
               <w:r>
                 <w:rPr>
                   <w:color w:val="1D4ED8"/>
@@ -27242,7 +27242,7 @@
             <w:vAlign w:val="top"/>
           </w:tcPr>
           <w:p>
-            <w:hyperlink w:history="1" r:id="rIdyjx33pq0313x2xtauw0pr">
+            <w:hyperlink w:history="1" r:id="rId7kwzp-tcdt0r6njuqifja">
               <w:r>
                 <w:rPr>
                   <w:color w:val="1D4ED8"/>
@@ -28321,7 +28321,7 @@
             <w:vAlign w:val="top"/>
           </w:tcPr>
           <w:p>
-            <w:hyperlink w:history="1" r:id="rIdvxblgu4yhnx4rpyli2_45">
+            <w:hyperlink w:history="1" r:id="rId2shbdrjtpbde13zkqk1uc">
               <w:r>
                 <w:rPr>
                   <w:color w:val="1D4ED8"/>
@@ -29700,7 +29700,7 @@
             <w:vAlign w:val="top"/>
           </w:tcPr>
           <w:p>
-            <w:hyperlink w:history="1" r:id="rIdzm5q0levguoalrozcae6t">
+            <w:hyperlink w:history="1" r:id="rIdb7sihve8zp_lyycy1j8jw">
               <w:r>
                 <w:rPr>
                   <w:color w:val="1D4ED8"/>
@@ -30508,7 +30508,7 @@
             <w:vAlign w:val="top"/>
           </w:tcPr>
           <w:p>
-            <w:hyperlink w:history="1" r:id="rIdl-tknu9vphnz7iwifwn8k">
+            <w:hyperlink w:history="1" r:id="rIda6dmjm2wvwscsx7wtqm3t">
               <w:r>
                 <w:rPr>
                   <w:color w:val="1D4ED8"/>
@@ -30570,7 +30570,7 @@
               </w:rPr>
               <w:t xml:space="preserve">Division of the Humanities and Social Sciences, California Institute of Technology (C. Hitchcock teaches philosophy at Caltech; the paper appears in Hitchcock's CV, </w:t>
             </w:r>
-            <w:hyperlink w:history="1" r:id="rId5tforxlfwf0_ywijiwcjw">
+            <w:hyperlink w:history="1" r:id="rId3vp_w4bzff-klpnsdrpa8">
               <w:r>
                 <w:rPr>
                   <w:color w:val="1D4ED8"/>
@@ -31605,7 +31605,7 @@
             <w:vAlign w:val="top"/>
           </w:tcPr>
           <w:p>
-            <w:hyperlink w:history="1" r:id="rIda7yk2ivdmmglnwg4bcvxc">
+            <w:hyperlink w:history="1" r:id="rIdazjjfh-kotfhcenaz2w5y">
               <w:r>
                 <w:rPr>
                   <w:color w:val="1D4ED8"/>
@@ -34640,7 +34640,7 @@
         <w:jc w:val="both"/>
       </w:pPr>
       <w:r>
-        <w:t xml:space="preserve">The negative result of [C2], exponentially large equivalence classes when there are cycles or hidden causes, sets the theoretical limit of the discovery problem. Complex systems have exactly feedback and hidden variables, so without interventions, temporal information or physical knowledge the structure remains ambiguous. The papers that succeed overcome this limit with dynamical structure [BK3], with interventions [P1, C4] or with state dependence [C1].</w:t>
+        <w:t xml:space="preserve">The negative result of [C2], exponentially large equivalence classes when there are cycles or hidden causes, sets the theoretical limit of the discovery problem. Complex systems have precisely these features, feedback and hidden variables, so without interventions, temporal information or physical knowledge the structure remains ambiguous. The papers that succeed overcome this limit with dynamical structure [BK3], with interventions [P1, C4] or with state dependence [C1].</w:t>
       </w:r>
     </w:p>
     <w:p>
@@ -34665,7 +34665,7 @@
         <w:jc w:val="both"/>
       </w:pPr>
       <w:r>
-        <w:t xml:space="preserve">The salinization of a well is an event with many causes, pumping, drought, tides, neighboring wells, which can offset or reinforce each other [BK2, P4]; attribution requires a causal model of the whole chain [O3].</w:t>
+        <w:t xml:space="preserve">The salinization of a well is an event with many causes—pumping, drought, tides, neighboring wells—which can offset or reinforce each other [BK2, P4]; attribution requires a causal model of the whole chain [O3].</w:t>
       </w:r>
     </w:p>
     <w:p>
@@ -34889,7 +34889,7 @@
               </w:rPr>
               <w:t xml:space="preserve">, 15, 4530. </w:t>
             </w:r>
-            <w:hyperlink w:history="1" r:id="rId1takvgl89sjmhmp6qnrq7">
+            <w:hyperlink w:history="1" r:id="rIdyrhm__7x8yf9ykvwt2zlc">
               <w:r>
                 <w:rPr>
                   <w:color w:val="1D4ED8"/>
@@ -34986,7 +34986,7 @@
               </w:rPr>
               <w:t xml:space="preserve">, 166, 13. </w:t>
             </w:r>
-            <w:hyperlink w:history="1" r:id="rIdnkp_dfcrbafazvuej8lr8">
+            <w:hyperlink w:history="1" r:id="rIdrwegwb4yzc755gtofiyjb">
               <w:r>
                 <w:rPr>
                   <w:color w:val="1D4ED8"/>
@@ -35082,7 +35082,7 @@
               </w:rPr>
               <w:t xml:space="preserve">, 116(536), 1865–1880. </w:t>
             </w:r>
-            <w:hyperlink w:history="1" r:id="rIdd4-9gey8tndhowduvamck">
+            <w:hyperlink w:history="1" r:id="rIddyfm4pto0unclpxcrwwzn">
               <w:r>
                 <w:rPr>
                   <w:color w:val="1D4ED8"/>
@@ -35179,7 +35179,7 @@
               </w:rPr>
               <w:t xml:space="preserve">, 117, 10706–10714. </w:t>
             </w:r>
-            <w:hyperlink w:history="1" r:id="rIdyt7kbufec0e63kts2jain">
+            <w:hyperlink w:history="1" r:id="rIdkpxe6ryzk-3hxcip5d9rs">
               <w:r>
                 <w:rPr>
                   <w:color w:val="1D4ED8"/>
@@ -35275,7 +35275,7 @@
               </w:rPr>
               <w:t xml:space="preserve">, 584 (pages not seen). </w:t>
             </w:r>
-            <w:hyperlink w:history="1" r:id="rId0cofi9-_fczgmbb96agui">
+            <w:hyperlink w:history="1" r:id="rIdynp3r4vxuyojwxcyn-baf">
               <w:r>
                 <w:rPr>
                   <w:color w:val="1D4ED8"/>
@@ -35372,7 +35372,7 @@
               </w:rPr>
               <w:t xml:space="preserve">, 116(536), 1789–1803. </w:t>
             </w:r>
-            <w:hyperlink w:history="1" r:id="rIdgobp4nnunsvcimwahs6fd">
+            <w:hyperlink w:history="1" r:id="rIdtwglx1yuaqtidxb3juykc">
               <w:r>
                 <w:rPr>
                   <w:color w:val="1D4ED8"/>
@@ -35468,7 +35468,7 @@
               </w:rPr>
               <w:t xml:space="preserve">, 7, 41. </w:t>
             </w:r>
-            <w:hyperlink w:history="1" r:id="rIdtpm25qhlmujcmaex7yw5h">
+            <w:hyperlink w:history="1" r:id="rIdzcr3hrc7yvq98sxr4jotp">
               <w:r>
                 <w:rPr>
                   <w:color w:val="1D4ED8"/>
@@ -35565,7 +35565,7 @@
               </w:rPr>
               <w:t xml:space="preserve">, 10, 1008–1025. </w:t>
             </w:r>
-            <w:hyperlink w:history="1" r:id="rId_z77f_y09uzf635ibs-vr">
+            <w:hyperlink w:history="1" r:id="rIdmwuhqmq2hxdvtmwxoyhey">
               <w:r>
                 <w:rPr>
                   <w:color w:val="1D4ED8"/>
@@ -35661,7 +35661,7 @@
               </w:rPr>
               <w:t xml:space="preserve">, 7(2), 30. </w:t>
             </w:r>
-            <w:hyperlink w:history="1" r:id="rIdu4st3lbh98qjq_si7cjwg">
+            <w:hyperlink w:history="1" r:id="rIdamp73zz4zizcpyqjzpxmu">
               <w:r>
                 <w:rPr>
                   <w:color w:val="1D4ED8"/>
@@ -35758,7 +35758,7 @@
               </w:rPr>
               <w:t xml:space="preserve">, 187(21). </w:t>
             </w:r>
-            <w:hyperlink w:history="1" r:id="rIdwfdjtrcuhkmnxbddmljfy">
+            <w:hyperlink w:history="1" r:id="rIdujtxn-umbywszgjv3o3dk">
               <w:r>
                 <w:rPr>
                   <w:color w:val="1D4ED8"/>
@@ -39610,7 +39610,7 @@
         <w:t xml:space="preserve">INNOVATION  </w:t>
       </w:r>
       <w:r>
-        <w:t xml:space="preserve">ATRIB-GO treats the salinization of a well as an event with causes and attributes it with twin worlds that share the same recharge. It thus unites probabilistic attribution (PN = FAR, identified by the monotonicity of the pumping effect) with storyline attribution (the PN of the concrete event, conditioned on its circumstances) in a single framework, and turns attribution into a design goal: the value of a measurement is measured by how much it reduces the uncertainty about the necessity of the pumping. The result runs against the intuition from prediction: for attribution, what counts are measurements of the exogenous forcing with sufficient time resolution, not measurements of the aquifer state.</w:t>
+        <w:t xml:space="preserve">ATRIB-GO treats the salinization of a well as an event with causes and attributes it with twin worlds that share the same recharge. It thus unites probabilistic attribution (PN = FAR, identified by the monotonicity of the pumping effect) with storyline attribution (the PN of the concrete event, conditioned on its circumstances) in a single framework, and turns attribution into a design goal: the value of a measurement is given by how much it reduces the uncertainty about the necessity of the pumping. The result runs against the intuition from prediction: for attribution, what counts are measurements of the exogenous forcing with sufficient time resolution, not measurements of the aquifer state.</w:t>
       </w:r>
     </w:p>
     <w:p>
@@ -39664,7 +39664,7 @@
         </m:sSub>
       </m:oMath>
       <w:r>
-        <w:t xml:space="preserve">, PN and PS are computed with the calibrated model and the recharge statistics; this gives the probabilistic attribution, which can be set before any event. (2) The precipitation and recharge series are stored with at least monthly resolution and with known error, because they are the circumstances that make the attribution of a single event possible. (3) When a well is salinized, the PN of the event is computed by conditioning the recharge history on these data; the “more likely than not” threshold, PN &gt; 0.5, is the one usually used in liability decisions.</w:t>
+        <w:t xml:space="preserve">, PN and PS are computed with the calibrated model and the recharge statistics; this gives the probabilistic attribution, which can be established before any event. (2) The precipitation and recharge series are stored with at least monthly resolution and with known error, because they are the circumstances that make the attribution of a single event possible. (3) When a well is salinized, the PN of the event is computed by conditioning the recharge history on these data; the “more likely than not” threshold, PN &gt; 0.5, is the one usually used in liability decisions.</w:t>
       </w:r>
     </w:p>
     <w:p>
@@ -40402,7 +40402,7 @@
         </w:rPr>
         <w:t xml:space="preserve"> </w:t>
       </w:r>
-      <w:hyperlink w:history="1" r:id="rIdqv31snvl-a6hojmrjxodf">
+      <w:hyperlink w:history="1" r:id="rIdx2ln89y8bav65xkzrsidg">
         <w:r>
           <w:rPr>
             <w:color w:val="1D4ED8"/>
@@ -40463,7 +40463,7 @@
         </w:rPr>
         <w:t xml:space="preserve"> </w:t>
       </w:r>
-      <w:hyperlink w:history="1" r:id="rIdz2l_24twpaihzadonfayz">
+      <w:hyperlink w:history="1" r:id="rIdz4waf10nyudccl9fszmsv">
         <w:r>
           <w:rPr>
             <w:color w:val="1D4ED8"/>
@@ -40524,7 +40524,7 @@
         </w:rPr>
         <w:t xml:space="preserve"> </w:t>
       </w:r>
-      <w:hyperlink w:history="1" r:id="rIdddfbqoqqgq-hdny74tsud">
+      <w:hyperlink w:history="1" r:id="rId6ji12uh3ro5akr4f8uwjh">
         <w:r>
           <w:rPr>
             <w:color w:val="1D4ED8"/>
@@ -40585,7 +40585,7 @@
         </w:rPr>
         <w:t xml:space="preserve"> </w:t>
       </w:r>
-      <w:hyperlink w:history="1" r:id="rIdfylimzs__y-pk065jofoi">
+      <w:hyperlink w:history="1" r:id="rIdcz0kjprw26nrqw0tebdii">
         <w:r>
           <w:rPr>
             <w:color w:val="1D4ED8"/>
@@ -40646,7 +40646,7 @@
         </w:rPr>
         <w:t xml:space="preserve"> </w:t>
       </w:r>
-      <w:hyperlink w:history="1" r:id="rIddl2pdexyb27guomqh9moe">
+      <w:hyperlink w:history="1" r:id="rId31aqafso0cf3wsxdvrllh">
         <w:r>
           <w:rPr>
             <w:color w:val="1D4ED8"/>
@@ -40707,7 +40707,7 @@
         </w:rPr>
         <w:t xml:space="preserve"> </w:t>
       </w:r>
-      <w:hyperlink w:history="1" r:id="rIdukxfholukngksjespxamg">
+      <w:hyperlink w:history="1" r:id="rId-dpxmcku66jpgcbxsjz53">
         <w:r>
           <w:rPr>
             <w:color w:val="1D4ED8"/>
@@ -40768,7 +40768,7 @@
         </w:rPr>
         <w:t xml:space="preserve"> </w:t>
       </w:r>
-      <w:hyperlink w:history="1" r:id="rIdj3uwdzgw7vruinuc0hktz">
+      <w:hyperlink w:history="1" r:id="rIdvgxul6uxk4kdfvvc9alht">
         <w:r>
           <w:rPr>
             <w:color w:val="1D4ED8"/>
@@ -40829,7 +40829,7 @@
         </w:rPr>
         <w:t xml:space="preserve"> </w:t>
       </w:r>
-      <w:hyperlink w:history="1" r:id="rId-ujejqv8p9y1ox4g4xgew">
+      <w:hyperlink w:history="1" r:id="rIdmhvu54eb03zwaz_wp6lep">
         <w:r>
           <w:rPr>
             <w:color w:val="1D4ED8"/>
@@ -40890,7 +40890,7 @@
         </w:rPr>
         <w:t xml:space="preserve"> </w:t>
       </w:r>
-      <w:hyperlink w:history="1" r:id="rIdzyfdokna4poqdlfml-x4w">
+      <w:hyperlink w:history="1" r:id="rIdlkibntjt5rxkz8ku17uqj">
         <w:r>
           <w:rPr>
             <w:color w:val="1D4ED8"/>
@@ -40951,7 +40951,7 @@
         </w:rPr>
         <w:t xml:space="preserve"> </w:t>
       </w:r>
-      <w:hyperlink w:history="1" r:id="rIdnv1vlmfngewsmbeg6fbbp">
+      <w:hyperlink w:history="1" r:id="rIdunkodvjkm1srwlzpmfdik">
         <w:r>
           <w:rPr>
             <w:color w:val="1D4ED8"/>
@@ -41012,7 +41012,7 @@
         </w:rPr>
         <w:t xml:space="preserve"> </w:t>
       </w:r>
-      <w:hyperlink w:history="1" r:id="rIdl4napvmylz_csfnjpjccm">
+      <w:hyperlink w:history="1" r:id="rIdljpytvhzxm07ujwmlichw">
         <w:r>
           <w:rPr>
             <w:color w:val="1D4ED8"/>
@@ -41073,7 +41073,7 @@
         </w:rPr>
         <w:t xml:space="preserve"> </w:t>
       </w:r>
-      <w:hyperlink w:history="1" r:id="rIdtkgs3dfpovainqzc9x2ox">
+      <w:hyperlink w:history="1" r:id="rIdappr527cm2-wqce3t9i0r">
         <w:r>
           <w:rPr>
             <w:color w:val="1D4ED8"/>
@@ -41134,7 +41134,7 @@
         </w:rPr>
         <w:t xml:space="preserve"> </w:t>
       </w:r>
-      <w:hyperlink w:history="1" r:id="rIdwloxvnyavqfljqm7z8whc">
+      <w:hyperlink w:history="1" r:id="rIdc7o-7yfnpkodhvwq5dj7p">
         <w:r>
           <w:rPr>
             <w:color w:val="1D4ED8"/>
@@ -41324,7 +41324,7 @@
         </w:rPr>
         <w:t xml:space="preserve"> </w:t>
       </w:r>
-      <w:hyperlink w:history="1" r:id="rIdxymq8wlunolyb1jr87qqd">
+      <w:hyperlink w:history="1" r:id="rIdu9tbrqfmgqqjs7vpg8s00">
         <w:r>
           <w:rPr>
             <w:color w:val="1D4ED8"/>
@@ -41385,7 +41385,7 @@
         </w:rPr>
         <w:t xml:space="preserve"> </w:t>
       </w:r>
-      <w:hyperlink w:history="1" r:id="rIdrk63rb-aznii4crg0o1vx">
+      <w:hyperlink w:history="1" r:id="rIdgy0fw8p92mttcswk0gypb">
         <w:r>
           <w:rPr>
             <w:color w:val="1D4ED8"/>
@@ -41500,7 +41500,7 @@
         </w:rPr>
         <w:t xml:space="preserve"> </w:t>
       </w:r>
-      <w:hyperlink w:history="1" r:id="rId9uiv0mohtr0neg27-k8jw">
+      <w:hyperlink w:history="1" r:id="rIduj1j7drjqm6kyrzq099p6">
         <w:r>
           <w:rPr>
             <w:color w:val="1D4ED8"/>
@@ -41561,7 +41561,7 @@
         </w:rPr>
         <w:t xml:space="preserve"> </w:t>
       </w:r>
-      <w:hyperlink w:history="1" r:id="rId0apkanpse6rb08z__txyk">
+      <w:hyperlink w:history="1" r:id="rIdc7skx3y0avnjnfzbu_pjo">
         <w:r>
           <w:rPr>
             <w:color w:val="1D4ED8"/>
@@ -41622,7 +41622,7 @@
         </w:rPr>
         <w:t xml:space="preserve"> </w:t>
       </w:r>
-      <w:hyperlink w:history="1" r:id="rIdiorm7hbgdg_sdxwlp01uy">
+      <w:hyperlink w:history="1" r:id="rIdt3tsn9rugd8l3y1rahtfe">
         <w:r>
           <w:rPr>
             <w:color w:val="1D4ED8"/>
@@ -41683,7 +41683,7 @@
         </w:rPr>
         <w:t xml:space="preserve"> </w:t>
       </w:r>
-      <w:hyperlink w:history="1" r:id="rId2ldt7lizczwqlg1rmudv-">
+      <w:hyperlink w:history="1" r:id="rIdxg3kdtyovfrkoh0ur0-fb">
         <w:r>
           <w:rPr>
             <w:color w:val="1D4ED8"/>
@@ -41744,7 +41744,7 @@
         </w:rPr>
         <w:t xml:space="preserve"> </w:t>
       </w:r>
-      <w:hyperlink w:history="1" r:id="rIdwcycj5gyvya70tufgeypz">
+      <w:hyperlink w:history="1" r:id="rIdixtz-tqt2ims-wel8dmrj">
         <w:r>
           <w:rPr>
             <w:color w:val="1D4ED8"/>
@@ -41805,7 +41805,7 @@
         </w:rPr>
         <w:t xml:space="preserve"> </w:t>
       </w:r>
-      <w:hyperlink w:history="1" r:id="rIdmxvvdim22a1ujhfyyq05x">
+      <w:hyperlink w:history="1" r:id="rIdohfds96y56j4qd_uoxivz">
         <w:r>
           <w:rPr>
             <w:color w:val="1D4ED8"/>
@@ -41866,7 +41866,7 @@
         </w:rPr>
         <w:t xml:space="preserve"> </w:t>
       </w:r>
-      <w:hyperlink w:history="1" r:id="rIdkqozgybq3pbe_j9ymgzeu">
+      <w:hyperlink w:history="1" r:id="rIdbpiduvoooydu4-42lp_e5">
         <w:r>
           <w:rPr>
             <w:color w:val="1D4ED8"/>
@@ -41927,7 +41927,7 @@
         </w:rPr>
         <w:t xml:space="preserve"> </w:t>
       </w:r>
-      <w:hyperlink w:history="1" r:id="rIdlnxl0a7vhpaoh0-_yu4gq">
+      <w:hyperlink w:history="1" r:id="rIdh5kt97jj-r0uvxivbghlw">
         <w:r>
           <w:rPr>
             <w:color w:val="1D4ED8"/>
@@ -41988,7 +41988,7 @@
         </w:rPr>
         <w:t xml:space="preserve"> </w:t>
       </w:r>
-      <w:hyperlink w:history="1" r:id="rIdowg4hidze0ubijtmunojk">
+      <w:hyperlink w:history="1" r:id="rIdgv-qoja1kjnhrhmwhzvfy">
         <w:r>
           <w:rPr>
             <w:color w:val="1D4ED8"/>
@@ -42049,7 +42049,7 @@
         </w:rPr>
         <w:t xml:space="preserve"> </w:t>
       </w:r>
-      <w:hyperlink w:history="1" r:id="rIdivvsuiqbu2oe9g37cuxc4">
+      <w:hyperlink w:history="1" r:id="rIdli5810gtg9cngcnkhjv3k">
         <w:r>
           <w:rPr>
             <w:color w:val="1D4ED8"/>
@@ -42110,7 +42110,7 @@
         </w:rPr>
         <w:t xml:space="preserve"> </w:t>
       </w:r>
-      <w:hyperlink w:history="1" r:id="rIdpedr6dqshbuzifpxsqgrq">
+      <w:hyperlink w:history="1" r:id="rIdvfnokuiqxmmjou61zz6h2">
         <w:r>
           <w:rPr>
             <w:color w:val="1D4ED8"/>
@@ -42171,7 +42171,7 @@
         </w:rPr>
         <w:t xml:space="preserve"> </w:t>
       </w:r>
-      <w:hyperlink w:history="1" r:id="rId0_vjzigwk4rl5ajqdank_">
+      <w:hyperlink w:history="1" r:id="rIdkhmryg7isv4pkld60p06x">
         <w:r>
           <w:rPr>
             <w:color w:val="1D4ED8"/>
@@ -42232,7 +42232,7 @@
         </w:rPr>
         <w:t xml:space="preserve"> </w:t>
       </w:r>
-      <w:hyperlink w:history="1" r:id="rIdxidgoxzbb5rii2iao6jml">
+      <w:hyperlink w:history="1" r:id="rIdpg6cel2h_nf6fwtk9scez">
         <w:r>
           <w:rPr>
             <w:color w:val="1D4ED8"/>
@@ -42293,7 +42293,7 @@
         </w:rPr>
         <w:t xml:space="preserve"> </w:t>
       </w:r>
-      <w:hyperlink w:history="1" r:id="rIdyjo9gssoung62er8gfr1f">
+      <w:hyperlink w:history="1" r:id="rIdrsahbrtgjw_xikxrpnuq7">
         <w:r>
           <w:rPr>
             <w:color w:val="1D4ED8"/>
@@ -42354,7 +42354,7 @@
         </w:rPr>
         <w:t xml:space="preserve"> </w:t>
       </w:r>
-      <w:hyperlink w:history="1" r:id="rIdkie5c7g7xjhc0jlbcop5i">
+      <w:hyperlink w:history="1" r:id="rIdyn3kkb90g6vez2amiw50t">
         <w:r>
           <w:rPr>
             <w:color w:val="1D4ED8"/>
@@ -42415,7 +42415,7 @@
         </w:rPr>
         <w:t xml:space="preserve"> </w:t>
       </w:r>
-      <w:hyperlink w:history="1" r:id="rIduxy_vbutpw9qkmjxh2xa4">
+      <w:hyperlink w:history="1" r:id="rIdw4jgiyqhdxlrkifzed47z">
         <w:r>
           <w:rPr>
             <w:color w:val="1D4ED8"/>
@@ -42476,7 +42476,7 @@
         </w:rPr>
         <w:t xml:space="preserve"> </w:t>
       </w:r>
-      <w:hyperlink w:history="1" r:id="rIdtqjnwzw-f9olqaz7kctid">
+      <w:hyperlink w:history="1" r:id="rId8brmm7kq2e7_29xmrdb_5">
         <w:r>
           <w:rPr>
             <w:color w:val="1D4ED8"/>
@@ -42537,7 +42537,7 @@
         </w:rPr>
         <w:t xml:space="preserve"> </w:t>
       </w:r>
-      <w:hyperlink w:history="1" r:id="rIdr4pptevj4nk4ewanrjrlp">
+      <w:hyperlink w:history="1" r:id="rId68xlq7qv4vzylvvp8qnhl">
         <w:r>
           <w:rPr>
             <w:color w:val="1D4ED8"/>
@@ -42598,7 +42598,7 @@
         </w:rPr>
         <w:t xml:space="preserve"> </w:t>
       </w:r>
-      <w:hyperlink w:history="1" r:id="rId2ucg2dspu3p-4ocl9shc-">
+      <w:hyperlink w:history="1" r:id="rIdno3eta3bcp02hkhoiekz6">
         <w:r>
           <w:rPr>
             <w:color w:val="1D4ED8"/>
@@ -42659,7 +42659,7 @@
         </w:rPr>
         <w:t xml:space="preserve"> </w:t>
       </w:r>
-      <w:hyperlink w:history="1" r:id="rId8kg8jo96knk068xlnyvsx">
+      <w:hyperlink w:history="1" r:id="rId3rxr6-tongz2urq4i0gqq">
         <w:r>
           <w:rPr>
             <w:color w:val="1D4ED8"/>

</xml_diff>